<commit_message>
docs(team): make Sathya Scrum Master and Tanuj QA Lead (#1)
</commit_message>
<xml_diff>
--- a/docs/Test_Plan/Student_Record_System_Test_Plan.docx
+++ b/docs/Test_Plan/Student_Record_System_Test_Plan.docx
@@ -466,7 +466,7 @@
           <w:sz w:val="21"/>
           <w:szCs w:val="21"/>
         </w:rPr>
-        <w:t xml:space="preserve">1.1</w:t>
+        <w:t xml:space="preserve">1.2</w:t>
       </w:r>
     </w:p>
     <w:p>
@@ -512,7 +512,7 @@
           <w:sz w:val="21"/>
           <w:szCs w:val="21"/>
         </w:rPr>
-        <w:t xml:space="preserve">13-10-2026</w:t>
+        <w:t xml:space="preserve">30-10-2026</w:t>
       </w:r>
     </w:p>
     <w:p>
@@ -896,6 +896,101 @@
                 <w:szCs w:val="18"/>
               </w:rPr>
               <w:t xml:space="preserve">Schedule aligned to the Part-2 sprint plan; sprint-wise test scope added; GitHub Projects/Actions added to tools; Scrum Master, QA Lead and Repo Owner combined into one role; Product Owner / Course Coordinator named; RTM now references SAD components and sprints</w:t>
+            </w:r>
+          </w:p>
+        </w:tc>
+      </w:tr>
+      <w:tr>
+        <w:trPr>
+          <w:cantSplit/>
+        </w:trPr>
+        <w:tc>
+          <w:tcPr>
+            <w:tcW w:type="dxa" w:w="1100"/>
+            <w:tcBorders>
+              <w:top w:val="single" w:color="999999" w:sz="4"/>
+              <w:left w:val="single" w:color="999999" w:sz="4"/>
+              <w:bottom w:val="single" w:color="999999" w:sz="4"/>
+              <w:right w:val="single" w:color="999999" w:sz="4"/>
+            </w:tcBorders>
+            <w:tcMar>
+              <w:top w:type="dxa" w:w="50"/>
+              <w:left w:type="dxa" w:w="90"/>
+              <w:bottom w:type="dxa" w:w="50"/>
+              <w:right w:type="dxa" w:w="90"/>
+            </w:tcMar>
+          </w:tcPr>
+          <w:p>
+            <w:pPr>
+              <w:spacing w:after="30"/>
+            </w:pPr>
+            <w:r>
+              <w:rPr>
+                <w:rFonts w:ascii="Arial" w:cs="Arial" w:eastAsia="Arial" w:hAnsi="Arial"/>
+                <w:sz w:val="18"/>
+                <w:szCs w:val="18"/>
+              </w:rPr>
+              <w:t xml:space="preserve">1.2</w:t>
+            </w:r>
+          </w:p>
+        </w:tc>
+        <w:tc>
+          <w:tcPr>
+            <w:tcW w:type="dxa" w:w="1500"/>
+            <w:tcBorders>
+              <w:top w:val="single" w:color="999999" w:sz="4"/>
+              <w:left w:val="single" w:color="999999" w:sz="4"/>
+              <w:bottom w:val="single" w:color="999999" w:sz="4"/>
+              <w:right w:val="single" w:color="999999" w:sz="4"/>
+            </w:tcBorders>
+            <w:tcMar>
+              <w:top w:type="dxa" w:w="50"/>
+              <w:left w:type="dxa" w:w="90"/>
+              <w:bottom w:type="dxa" w:w="50"/>
+              <w:right w:type="dxa" w:w="90"/>
+            </w:tcMar>
+          </w:tcPr>
+          <w:p>
+            <w:pPr>
+              <w:spacing w:after="30"/>
+            </w:pPr>
+            <w:r>
+              <w:rPr>
+                <w:rFonts w:ascii="Arial" w:cs="Arial" w:eastAsia="Arial" w:hAnsi="Arial"/>
+                <w:sz w:val="18"/>
+                <w:szCs w:val="18"/>
+              </w:rPr>
+              <w:t xml:space="preserve">30-10-2026</w:t>
+            </w:r>
+          </w:p>
+        </w:tc>
+        <w:tc>
+          <w:tcPr>
+            <w:tcW w:type="dxa" w:w="7146"/>
+            <w:tcBorders>
+              <w:top w:val="single" w:color="999999" w:sz="4"/>
+              <w:left w:val="single" w:color="999999" w:sz="4"/>
+              <w:bottom w:val="single" w:color="999999" w:sz="4"/>
+              <w:right w:val="single" w:color="999999" w:sz="4"/>
+            </w:tcBorders>
+            <w:tcMar>
+              <w:top w:type="dxa" w:w="50"/>
+              <w:left w:type="dxa" w:w="90"/>
+              <w:bottom w:type="dxa" w:w="50"/>
+              <w:right w:type="dxa" w:w="90"/>
+            </w:tcMar>
+          </w:tcPr>
+          <w:p>
+            <w:pPr>
+              <w:spacing w:after="30"/>
+            </w:pPr>
+            <w:r>
+              <w:rPr>
+                <w:rFonts w:ascii="Arial" w:cs="Arial" w:eastAsia="Arial" w:hAnsi="Arial"/>
+                <w:sz w:val="18"/>
+                <w:szCs w:val="18"/>
+              </w:rPr>
+              <w:t xml:space="preserve">Roles updated: T S Sathya Kiran is Scrum Master / Repo Owner; Tanuj N is QA Lead / Test Engineer</w:t>
             </w:r>
           </w:p>
         </w:tc>
@@ -7367,7 +7462,7 @@
                 <w:sz w:val="18"/>
                 <w:szCs w:val="18"/>
               </w:rPr>
-              <w:t xml:space="preserve">Scrum Master / QA Lead / Repo Owner</w:t>
+              <w:t xml:space="preserve">Scrum Master / Repo Owner</w:t>
             </w:r>
           </w:p>
         </w:tc>
@@ -7397,7 +7492,7 @@
                 <w:sz w:val="18"/>
                 <w:szCs w:val="18"/>
               </w:rPr>
-              <w:t xml:space="preserve">Tanuj N</w:t>
+              <w:t xml:space="preserve">T S Sathya Kiran</w:t>
             </w:r>
           </w:p>
         </w:tc>
@@ -7427,7 +7522,7 @@
                 <w:sz w:val="18"/>
                 <w:szCs w:val="18"/>
               </w:rPr>
-              <w:t xml:space="preserve">Plan sprints and maintain the GitHub Project board; prepare the plan, maintain the RTM, coordinate execution and triage defects; review and merge pull requests only after automated checks pass; prepare the Test Summary Report</w:t>
+              <w:t xml:space="preserve">Plan sprints and maintain the GitHub Project board; assign issues, owners and reviewers; run sprint planning, review and retrospective; review and merge pull requests only after automated checks pass</w:t>
             </w:r>
           </w:p>
         </w:tc>
@@ -7462,7 +7557,7 @@
                 <w:sz w:val="18"/>
                 <w:szCs w:val="18"/>
               </w:rPr>
-              <w:t xml:space="preserve">Test Engineer</w:t>
+              <w:t xml:space="preserve">QA Lead / Test Engineer</w:t>
             </w:r>
           </w:p>
         </w:tc>
@@ -7492,7 +7587,7 @@
                 <w:sz w:val="18"/>
                 <w:szCs w:val="18"/>
               </w:rPr>
-              <w:t xml:space="preserve">T S Sathya Kiran</w:t>
+              <w:t xml:space="preserve">Tanuj N</w:t>
             </w:r>
           </w:p>
         </w:tc>
@@ -7522,7 +7617,7 @@
                 <w:sz w:val="18"/>
                 <w:szCs w:val="18"/>
               </w:rPr>
-              <w:t xml:space="preserve">Design and execute test cases, automate tests, log defects</w:t>
+              <w:t xml:space="preserve">Prepare the plan and maintain the RTM; design, automate and execute test cases; coordinate execution and triage defects; run the final regression and prepare the Test Summary Report</w:t>
             </w:r>
           </w:p>
         </w:tc>

</xml_diff>